<commit_message>
docs: atualiza documentacao de TI com funcionalidades novas e info de banco
Documento de Ciencia e Enquadramento: adiciona secao com as funcionalidades
entregues em julho/2026 (somente leitura, fotos por peca, alertas de
movimentacao em tela cheia, acesso da Logistica a Entregas), expande a
secao tecnica com tabelas do banco, migracoes e forma de conexao, e
registra o incidente do backup automatico (corrigido em 15/07).

Relatorio de Acompanhamento: atualiza data de referencia e todos os
numeros/tabela de pedidos com o estado atual do banco de producao.
</commit_message>
<xml_diff>
--- a/docs/Documento_Ciencia_TI_Sistema_PCP_2026-07.docx
+++ b/docs/Documento_Ciencia_TI_Sistema_PCP_2026-07.docx
@@ -243,6 +243,57 @@
                 <w:b/>
                 <w:bCs/>
               </w:rPr>
+              <w:t xml:space="preserve">Última atualização</w:t>
+            </w:r>
+          </w:p>
+        </w:tc>
+        <w:tc>
+          <w:tcPr>
+            <w:tcW w:type="dxa" w:w="7020"/>
+            <w:tcBorders>
+              <w:top w:val="single" w:color="CCCCCC" w:sz="1"/>
+              <w:left w:val="single" w:color="CCCCCC" w:sz="1"/>
+              <w:bottom w:val="single" w:color="CCCCCC" w:sz="1"/>
+              <w:right w:val="single" w:color="CCCCCC" w:sz="1"/>
+            </w:tcBorders>
+            <w:tcMar>
+              <w:top w:type="dxa" w:w="100"/>
+              <w:left w:type="dxa" w:w="120"/>
+              <w:bottom w:type="dxa" w:w="100"/>
+              <w:right w:type="dxa" w:w="120"/>
+            </w:tcMar>
+          </w:tcPr>
+          <w:p>
+            <w:r>
+              <w:t xml:space="preserve">15/07/2026 — inclusão de novas funcionalidades e informações de banco de dados para a TI (seção 5)</w:t>
+            </w:r>
+          </w:p>
+        </w:tc>
+      </w:tr>
+      <w:tr>
+        <w:tc>
+          <w:tcPr>
+            <w:tcW w:type="dxa" w:w="2340"/>
+            <w:tcBorders>
+              <w:top w:val="single" w:color="CCCCCC" w:sz="1"/>
+              <w:left w:val="single" w:color="CCCCCC" w:sz="1"/>
+              <w:bottom w:val="single" w:color="CCCCCC" w:sz="1"/>
+              <w:right w:val="single" w:color="CCCCCC" w:sz="1"/>
+            </w:tcBorders>
+            <w:shd w:fill="E8F0FB" w:val="clear"/>
+            <w:tcMar>
+              <w:top w:type="dxa" w:w="100"/>
+              <w:left w:type="dxa" w:w="120"/>
+              <w:bottom w:type="dxa" w:w="100"/>
+              <w:right w:type="dxa" w:w="120"/>
+            </w:tcMar>
+          </w:tcPr>
+          <w:p>
+            <w:r>
+              <w:rPr>
+                <w:b/>
+                <w:bCs/>
+              </w:rPr>
               <w:t xml:space="preserve">Partes cientes</w:t>
             </w:r>
           </w:p>
@@ -658,6 +709,86 @@
     </w:p>
     <w:p>
       <w:pPr>
+        <w:pStyle w:val="ListParagraph"/>
+        <w:numPr>
+          <w:ilvl w:val="0"/>
+          <w:numId w:val="2"/>
+        </w:numPr>
+        <w:spacing w:after="100"/>
+      </w:pPr>
+      <w:r>
+        <w:rPr>
+          <w:b/>
+          <w:bCs/>
+        </w:rPr>
+        <w:t xml:space="preserve">Acesso somente leitura: </w:t>
+      </w:r>
+      <w:r>
+        <w:t xml:space="preserve">perfil que visualiza toda a operação (inclusive dados financeiros e telas administrativas) sem poder criar, editar, excluir ou movimentar nada — usado para colaboradores que só acompanham o processo.</w:t>
+      </w:r>
+    </w:p>
+    <w:p>
+      <w:pPr>
+        <w:pStyle w:val="ListParagraph"/>
+        <w:numPr>
+          <w:ilvl w:val="0"/>
+          <w:numId w:val="2"/>
+        </w:numPr>
+        <w:spacing w:after="100"/>
+      </w:pPr>
+      <w:r>
+        <w:rPr>
+          <w:b/>
+          <w:bCs/>
+        </w:rPr>
+        <w:t xml:space="preserve">Fotos por peça: </w:t>
+      </w:r>
+      <w:r>
+        <w:t xml:space="preserve">upload de fotos direto do celular nos setores de Acabamento e Embalagem, anexadas à peça e visíveis na Logística e no detalhe do pedido.</w:t>
+      </w:r>
+    </w:p>
+    <w:p>
+      <w:pPr>
+        <w:pStyle w:val="ListParagraph"/>
+        <w:numPr>
+          <w:ilvl w:val="0"/>
+          <w:numId w:val="2"/>
+        </w:numPr>
+        <w:spacing w:after="100"/>
+      </w:pPr>
+      <w:r>
+        <w:rPr>
+          <w:b/>
+          <w:bCs/>
+        </w:rPr>
+        <w:t xml:space="preserve">Alertas de movimentação em tela cheia: </w:t>
+      </w:r>
+      <w:r>
+        <w:t xml:space="preserve">aviso automático para Administração/PCP quando um pedido novo é criado ou um item muda de setor/status, com agrupamento em um único aviso quando várias peças do mesmo pedido se movem juntas.</w:t>
+      </w:r>
+    </w:p>
+    <w:p>
+      <w:pPr>
+        <w:pStyle w:val="ListParagraph"/>
+        <w:numPr>
+          <w:ilvl w:val="0"/>
+          <w:numId w:val="2"/>
+        </w:numPr>
+        <w:spacing w:after="100"/>
+      </w:pPr>
+      <w:r>
+        <w:rPr>
+          <w:b/>
+          <w:bCs/>
+        </w:rPr>
+        <w:t xml:space="preserve">Acesso por setor à aba Entregas: </w:t>
+      </w:r>
+      <w:r>
+        <w:t xml:space="preserve">o responsável pelo setor de Logística acompanha a tela de Entregas sem precisar de acesso administrativo completo.</w:t>
+      </w:r>
+    </w:p>
+    <w:p>
+      <w:pPr>
         <w:pStyle w:val="Heading1"/>
       </w:pPr>
       <w:r>
@@ -806,6 +937,86 @@
     </w:p>
     <w:p>
       <w:pPr>
+        <w:pStyle w:val="ListParagraph"/>
+        <w:numPr>
+          <w:ilvl w:val="0"/>
+          <w:numId w:val="2"/>
+        </w:numPr>
+        <w:spacing w:after="100"/>
+      </w:pPr>
+      <w:r>
+        <w:rPr>
+          <w:b/>
+          <w:bCs/>
+        </w:rPr>
+        <w:t xml:space="preserve">Tabelas principais: </w:t>
+      </w:r>
+      <w:r>
+        <w:t xml:space="preserve">producao_pedido (pedidos), producao_itempedido (itens do pedido), producao_itemparcial (divisão de um item entre setores/parciais), producao_movimentacaoitem (histórico de movimentações — auditoria de quem fez o quê e quando), producao_divergencia (reprovações/devoluções) e usuarios_usuario (usuários e permissões).</w:t>
+      </w:r>
+    </w:p>
+    <w:p>
+      <w:pPr>
+        <w:pStyle w:val="ListParagraph"/>
+        <w:numPr>
+          <w:ilvl w:val="0"/>
+          <w:numId w:val="2"/>
+        </w:numPr>
+        <w:spacing w:after="100"/>
+      </w:pPr>
+      <w:r>
+        <w:rPr>
+          <w:b/>
+          <w:bCs/>
+        </w:rPr>
+        <w:t xml:space="preserve">Migrações de schema: </w:t>
+      </w:r>
+      <w:r>
+        <w:t xml:space="preserve">aplicadas automaticamente na inicialização do servidor (arquivo src/lib/migrations.ts, disparado via instrumentation.ts do Next.js) — cria colunas e índices novos sem intervenção manual no banco.</w:t>
+      </w:r>
+    </w:p>
+    <w:p>
+      <w:pPr>
+        <w:pStyle w:val="ListParagraph"/>
+        <w:numPr>
+          <w:ilvl w:val="0"/>
+          <w:numId w:val="2"/>
+        </w:numPr>
+        <w:spacing w:after="100"/>
+      </w:pPr>
+      <w:r>
+        <w:rPr>
+          <w:b/>
+          <w:bCs/>
+        </w:rPr>
+        <w:t xml:space="preserve">Conexão com o banco: </w:t>
+      </w:r>
+      <w:r>
+        <w:t xml:space="preserve">via connection pooler do Supabase (porta 6543, modo "transaction"), adequado para múltiplas conexões simultâneas vindas de funções serverless da Vercel.</w:t>
+      </w:r>
+    </w:p>
+    <w:p>
+      <w:pPr>
+        <w:pStyle w:val="ListParagraph"/>
+        <w:numPr>
+          <w:ilvl w:val="0"/>
+          <w:numId w:val="2"/>
+        </w:numPr>
+        <w:spacing w:after="100"/>
+      </w:pPr>
+      <w:r>
+        <w:rPr>
+          <w:b/>
+          <w:bCs/>
+        </w:rPr>
+        <w:t xml:space="preserve">Credenciais: </w:t>
+      </w:r>
+      <w:r>
+        <w:t xml:space="preserve">geridas como variáveis de ambiente na Vercel (não ficam no código nem no controle de versão); acesso/rotação apenas pela coordenação do PCP.</w:t>
+      </w:r>
+    </w:p>
+    <w:p>
+      <w:pPr>
         <w:pStyle w:val="Heading1"/>
       </w:pPr>
       <w:r>
@@ -898,6 +1109,46 @@
       </w:r>
       <w:r>
         <w:t xml:space="preserve">implantação de rotina de backup automatizado (nuvem e cópia local em pasta de rede da empresa) em julho de 2026.</w:t>
+      </w:r>
+    </w:p>
+    <w:p>
+      <w:pPr>
+        <w:pStyle w:val="ListParagraph"/>
+        <w:numPr>
+          <w:ilvl w:val="0"/>
+          <w:numId w:val="2"/>
+        </w:numPr>
+        <w:spacing w:after="100"/>
+      </w:pPr>
+      <w:r>
+        <w:rPr>
+          <w:b/>
+          <w:bCs/>
+        </w:rPr>
+        <w:t xml:space="preserve">Continuidade do backup automático: </w:t>
+      </w:r>
+      <w:r>
+        <w:t xml:space="preserve">identificado e corrigido em 15/07/2026 um problema em que o backup automático (nuvem, 2x/dia) ficou sem efeito por cerca de um dia após a migração de conta/projeto na Vercel em 13/07/2026 — a variável de configuração necessária não havia sido recriada no ambiente novo. Corrigido e validado com backup manual de confirmação.</w:t>
+      </w:r>
+    </w:p>
+    <w:p>
+      <w:pPr>
+        <w:pStyle w:val="ListParagraph"/>
+        <w:numPr>
+          <w:ilvl w:val="0"/>
+          <w:numId w:val="2"/>
+        </w:numPr>
+        <w:spacing w:after="100"/>
+      </w:pPr>
+      <w:r>
+        <w:rPr>
+          <w:b/>
+          <w:bCs/>
+        </w:rPr>
+        <w:t xml:space="preserve">Novas funcionalidades (julho/2026): </w:t>
+      </w:r>
+      <w:r>
+        <w:t xml:space="preserve">perfil de acesso somente leitura; liberação de "Todos os Pedidos" em modo leitura para todos os setores; novo setor de Corte Laser; filtro de prazo de entrega no Dashboard, Kanban e Todos os Pedidos; fotos por peça no Acabamento/Embalagem; alertas de movimentação em tela cheia para Administração/PCP; coluna "Criado em" e ordenação por data em Todos os Pedidos; acesso do responsável pela Logística à aba Entregas.</w:t>
       </w:r>
     </w:p>
     <w:p>

</xml_diff>

<commit_message>
docs: remove mencao ao alerta de tela cheia (feature revertida no mesmo dia)
O alerta de movimentacao em tela cheia foi implementado e depois removido
no mesmo dia (15/07) por gerar interrupcoes excessivas em dias de producao
intensa. Documentacao atualizada pra nao descrever uma funcionalidade que
nao existe mais.
</commit_message>
<xml_diff>
--- a/docs/Documento_Ciencia_TI_Sistema_PCP_2026-07.docx
+++ b/docs/Documento_Ciencia_TI_Sistema_PCP_2026-07.docx
@@ -761,26 +761,6 @@
           <w:b/>
           <w:bCs/>
         </w:rPr>
-        <w:t xml:space="preserve">Alertas de movimentação em tela cheia: </w:t>
-      </w:r>
-      <w:r>
-        <w:t xml:space="preserve">aviso automático para Administração/PCP quando um pedido novo é criado ou um item muda de setor/status, com agrupamento em um único aviso quando várias peças do mesmo pedido se movem juntas.</w:t>
-      </w:r>
-    </w:p>
-    <w:p>
-      <w:pPr>
-        <w:pStyle w:val="ListParagraph"/>
-        <w:numPr>
-          <w:ilvl w:val="0"/>
-          <w:numId w:val="2"/>
-        </w:numPr>
-        <w:spacing w:after="100"/>
-      </w:pPr>
-      <w:r>
-        <w:rPr>
-          <w:b/>
-          <w:bCs/>
-        </w:rPr>
         <w:t xml:space="preserve">Acesso por setor à aba Entregas: </w:t>
       </w:r>
       <w:r>
@@ -1148,7 +1128,7 @@
         <w:t xml:space="preserve">Novas funcionalidades (julho/2026): </w:t>
       </w:r>
       <w:r>
-        <w:t xml:space="preserve">perfil de acesso somente leitura; liberação de "Todos os Pedidos" em modo leitura para todos os setores; novo setor de Corte Laser; filtro de prazo de entrega no Dashboard, Kanban e Todos os Pedidos; fotos por peça no Acabamento/Embalagem; alertas de movimentação em tela cheia para Administração/PCP; coluna "Criado em" e ordenação por data em Todos os Pedidos; acesso do responsável pela Logística à aba Entregas.</w:t>
+        <w:t xml:space="preserve">perfil de acesso somente leitura; liberação de "Todos os Pedidos" em modo leitura para todos os setores; novo setor de Corte Laser; filtro de prazo de entrega no Dashboard, Kanban e Todos os Pedidos; fotos por peça no Acabamento/Embalagem; coluna "Criado em" e ordenação por data em Todos os Pedidos; acesso do responsável pela Logística à aba Entregas.</w:t>
       </w:r>
     </w:p>
     <w:p>

</xml_diff>

<commit_message>
docs(ti): atualiza Ciencia TI com Caldeiraria, Corte Serra e novidades de julho
- cabecalho: ultima atualizacao 27/07/2026
- secao 4: 15 setores (inclui Corte Serra) + item "Multiplas fabricas"
- secao 6: novas funcionalidades fim de julho (Caldeiraria como fabrica propria,
  kanban por fabrica, entrega completa na Logistica, idempotencia, fila por item)

Co-Authored-By: Claude Opus 4.8 <noreply@anthropic.com>
</commit_message>
<xml_diff>
--- a/docs/Documento_Ciencia_TI_Sistema_PCP_2026-07.docx
+++ b/docs/Documento_Ciencia_TI_Sistema_PCP_2026-07.docx
@@ -265,7 +265,7 @@
           </w:tcPr>
           <w:p>
             <w:r>
-              <w:t xml:space="preserve">15/07/2026 — inclusão de novas funcionalidades e informações de banco de dados para a TI (seção 5)</w:t>
+              <w:t xml:space="preserve">27/07/2026 — inclusão da Caldeiraria como fábrica própria, novo setor de Corte Serra e demais funcionalidades de produção (seção 6)</w:t>
             </w:r>
           </w:p>
         </w:tc>
@@ -584,7 +584,27 @@
         <w:t xml:space="preserve">Acompanhamento por setor: </w:t>
       </w:r>
       <w:r>
-        <w:t xml:space="preserve">14 setores de produção (emissão, usinagem, corte a maçarico, corte a plasma, corte a laser, estoque, furação, inspeção de qualidade, acabamento, logística, recebimento, compras, beneficiadores e embalagem), com fluxo de status (emitido → aguardando → recebido → em produção → pausado/bloqueado → finalizado no setor → em trânsito → entregue).</w:t>
+        <w:t xml:space="preserve">15 setores de produção (emissão, usinagem, corte a maçarico, corte a plasma, corte a laser, corte a serra, estoque, furação, inspeção de qualidade, acabamento, logística, recebimento, compras, beneficiadores e embalagem), com fluxo de status (emitido → aguardando → recebido → em produção → pausado/bloqueado → finalizado no setor → em trânsito → entregue).</w:t>
+      </w:r>
+    </w:p>
+    <w:p>
+      <w:pPr>
+        <w:pStyle w:val="ListParagraph"/>
+        <w:numPr>
+          <w:ilvl w:val="0"/>
+          <w:numId w:val="2"/>
+        </w:numPr>
+        <w:spacing w:after="100"/>
+      </w:pPr>
+      <w:r>
+        <w:rPr>
+          <w:b/>
+          <w:bCs/>
+        </w:rPr>
+        <w:t xml:space="preserve">Múltiplas fábricas com roteiros próprios: </w:t>
+      </w:r>
+      <w:r>
+        <w:t xml:space="preserve">separação entre Flange (Mogi das Cruzes, 100% operacional) e Caldeiraria (Arujá, em implantação), cada fábrica com suas próprias etapas, kanban e quadro de acompanhamento. A fábrica é definida por item, permitindo que um mesmo pedido tenha itens em fábricas diferentes.</w:t>
       </w:r>
     </w:p>
     <w:p>
@@ -1129,6 +1149,26 @@
       </w:r>
       <w:r>
         <w:t xml:space="preserve">perfil de acesso somente leitura; liberação de "Todos os Pedidos" em modo leitura para todos os setores; novo setor de Corte Laser; filtro de prazo de entrega no Dashboard, Kanban e Todos os Pedidos; fotos por peça no Acabamento/Embalagem; coluna "Criado em" e ordenação por data em Todos os Pedidos; acesso do responsável pela Logística à aba Entregas.</w:t>
+      </w:r>
+    </w:p>
+    <w:p>
+      <w:pPr>
+        <w:pStyle w:val="ListParagraph"/>
+        <w:numPr>
+          <w:ilvl w:val="0"/>
+          <w:numId w:val="2"/>
+        </w:numPr>
+        <w:spacing w:after="100"/>
+      </w:pPr>
+      <w:r>
+        <w:rPr>
+          <w:b/>
+          <w:bCs/>
+        </w:rPr>
+        <w:t xml:space="preserve">Novas funcionalidades (fim de julho/2026): </w:t>
+      </w:r>
+      <w:r>
+        <w:t xml:space="preserve">implantação da Caldeiraria (Arujá) como fábrica própria, com setores específicos (Desenho, Chanfradeira, Calandra, Montagem, Solda, Acabamento, Pintura, Inspeção/Qualidade e Liberado) e roteiro por tipo de produto; kanban separado por fábrica (Flange e Caldeiraria); seleção de fábrica na emissão, no corte e na edição do pedido, com a fábrica definida por item; novo setor de Corte Serra; entrega de pedido completo na Logística (com canhoto, sem nota fiscal); proteção contra duplicação de apontamentos em caso de queda de internet (idempotência); agrupamento da fila do setor por item, e não por código; aba “Todos os Produtos” para revisão antes do envio e rascunho local na criação de ordem; e restrição de usuários de PCP/staff a um setor específico.</w:t>
       </w:r>
     </w:p>
     <w:p>

</xml_diff>

<commit_message>
docs(ti): separa novidades de Caldeiraria e Flange/Logistica na secao 6.1
Atualiza o Documento de Ciencia TI com as evolucoes de 27 a 31/07,
organizadas por fabrica, sem alterar o conteudo ja existente.
</commit_message>
<xml_diff>
--- a/docs/Documento_Ciencia_TI_Sistema_PCP_2026-07.docx
+++ b/docs/Documento_Ciencia_TI_Sistema_PCP_2026-07.docx
@@ -265,7 +265,7 @@
           </w:tcPr>
           <w:p>
             <w:r>
-              <w:t xml:space="preserve">27/07/2026 — inclusão da Caldeiraria como fábrica própria, novo setor de Corte Serra e demais funcionalidades de produção (seção 6)</w:t>
+              <w:t xml:space="preserve">31/07/2026 — detalhamento das novidades de Caldeiraria e de Flange/Logística, separadas por fábrica (seção 6.1)</w:t>
             </w:r>
           </w:p>
         </w:tc>
@@ -1169,6 +1169,246 @@
       </w:r>
       <w:r>
         <w:t xml:space="preserve">implantação da Caldeiraria (Arujá) como fábrica própria, com setores específicos (Desenho, Chanfradeira, Calandra, Montagem, Solda, Acabamento, Pintura, Inspeção/Qualidade e Liberado) e roteiro por tipo de produto; kanban separado por fábrica (Flange e Caldeiraria); seleção de fábrica na emissão, no corte e na edição do pedido, com a fábrica definida por item; novo setor de Corte Serra; entrega de pedido completo na Logística (com canhoto, sem nota fiscal); proteção contra duplicação de apontamentos em caso de queda de internet (idempotência); agrupamento da fila do setor por item, e não por código; aba “Todos os Produtos” para revisão antes do envio e rascunho local na criação de ordem; e restrição de usuários de PCP/staff a um setor específico.</w:t>
+      </w:r>
+    </w:p>
+    <w:p>
+      <w:pPr>
+        <w:pStyle w:val="Heading2"/>
+      </w:pPr>
+      <w:r>
+        <w:t xml:space="preserve">6.1 Novas funcionalidades (30–31/07/2026), separadas por fábrica</w:t>
+      </w:r>
+    </w:p>
+    <w:p>
+      <w:pPr>
+        <w:spacing w:after="160"/>
+      </w:pPr>
+      <w:r>
+        <w:t xml:space="preserve">Complemento ao registro da seção 6, detalhando as evoluções mais recentes já organizadas entre as duas fábricas em operação.</w:t>
+      </w:r>
+    </w:p>
+    <w:p>
+      <w:pPr>
+        <w:pStyle w:val="Heading3"/>
+      </w:pPr>
+      <w:r>
+        <w:t xml:space="preserve">Caldeiraria (Arujá)</w:t>
+      </w:r>
+    </w:p>
+    <w:p>
+      <w:pPr>
+        <w:pStyle w:val="ListParagraph"/>
+        <w:numPr>
+          <w:ilvl w:val="0"/>
+          <w:numId w:val="2"/>
+        </w:numPr>
+        <w:spacing w:after="100"/>
+      </w:pPr>
+      <w:r>
+        <w:rPr>
+          <w:b/>
+          <w:bCs/>
+        </w:rPr>
+        <w:t xml:space="preserve">Sub-itens (receita) para produtos compostos: </w:t>
+      </w:r>
+      <w:r>
+        <w:t xml:space="preserve">a função "Montar Receita" passou a criar cada componente individualmente, com anexo próprio, e mantém os componentes já criados ao reabrir a tela.</w:t>
+      </w:r>
+    </w:p>
+    <w:p>
+      <w:pPr>
+        <w:pStyle w:val="ListParagraph"/>
+        <w:numPr>
+          <w:ilvl w:val="0"/>
+          <w:numId w:val="2"/>
+        </w:numPr>
+        <w:spacing w:after="100"/>
+      </w:pPr>
+      <w:r>
+        <w:rPr>
+          <w:b/>
+          <w:bCs/>
+        </w:rPr>
+        <w:t xml:space="preserve">Checklist de processo por etapa: </w:t>
+      </w:r>
+      <w:r>
+        <w:t xml:space="preserve">parametrizado por tipo de produto, complementando o checklist já existente no Recebimento.</w:t>
+      </w:r>
+    </w:p>
+    <w:p>
+      <w:pPr>
+        <w:pStyle w:val="ListParagraph"/>
+        <w:numPr>
+          <w:ilvl w:val="0"/>
+          <w:numId w:val="2"/>
+        </w:numPr>
+        <w:spacing w:after="100"/>
+      </w:pPr>
+      <w:r>
+        <w:rPr>
+          <w:b/>
+          <w:bCs/>
+        </w:rPr>
+        <w:t xml:space="preserve">Devolução para a Usinagem: </w:t>
+      </w:r>
+      <w:r>
+        <w:t xml:space="preserve">liberada como destino de devolução de itens da Caldeiraria.</w:t>
+      </w:r>
+    </w:p>
+    <w:p>
+      <w:pPr>
+        <w:pStyle w:val="Heading3"/>
+      </w:pPr>
+      <w:r>
+        <w:t xml:space="preserve">Flange / Logística</w:t>
+      </w:r>
+    </w:p>
+    <w:p>
+      <w:pPr>
+        <w:pStyle w:val="ListParagraph"/>
+        <w:numPr>
+          <w:ilvl w:val="0"/>
+          <w:numId w:val="2"/>
+        </w:numPr>
+        <w:spacing w:after="100"/>
+      </w:pPr>
+      <w:r>
+        <w:rPr>
+          <w:b/>
+          <w:bCs/>
+        </w:rPr>
+        <w:t xml:space="preserve">Entrega parcial com múltiplas notas fiscais: </w:t>
+      </w:r>
+      <w:r>
+        <w:t xml:space="preserve">a Logística passou a aceitar a entrega parcial de um item com mais de uma nota fiscal e canhoto associados.</w:t>
+      </w:r>
+    </w:p>
+    <w:p>
+      <w:pPr>
+        <w:pStyle w:val="ListParagraph"/>
+        <w:numPr>
+          <w:ilvl w:val="0"/>
+          <w:numId w:val="2"/>
+        </w:numPr>
+        <w:spacing w:after="100"/>
+      </w:pPr>
+      <w:r>
+        <w:rPr>
+          <w:b/>
+          <w:bCs/>
+        </w:rPr>
+        <w:t xml:space="preserve">Retirada pelo Cliente: </w:t>
+      </w:r>
+      <w:r>
+        <w:t xml:space="preserve">nova opção de saída na Logística, com a antiga opção "Coleta" renomeada para "Serviço Externo".</w:t>
+      </w:r>
+    </w:p>
+    <w:p>
+      <w:pPr>
+        <w:pStyle w:val="Heading3"/>
+      </w:pPr>
+      <w:r>
+        <w:t xml:space="preserve">Geral (ambas as fábricas)</w:t>
+      </w:r>
+    </w:p>
+    <w:p>
+      <w:pPr>
+        <w:pStyle w:val="ListParagraph"/>
+        <w:numPr>
+          <w:ilvl w:val="0"/>
+          <w:numId w:val="2"/>
+        </w:numPr>
+        <w:spacing w:after="100"/>
+      </w:pPr>
+      <w:r>
+        <w:rPr>
+          <w:b/>
+          <w:bCs/>
+        </w:rPr>
+        <w:t xml:space="preserve">Rastreio de projeto: </w:t>
+      </w:r>
+      <w:r>
+        <w:t xml:space="preserve">sub-itens passaram a ser agrupados junto do item pai, como um projeto só, com aviso no card quando o item faz parte de um projeto com peças em outros setores.</w:t>
+      </w:r>
+    </w:p>
+    <w:p>
+      <w:pPr>
+        <w:pStyle w:val="ListParagraph"/>
+        <w:numPr>
+          <w:ilvl w:val="0"/>
+          <w:numId w:val="2"/>
+        </w:numPr>
+        <w:spacing w:after="100"/>
+      </w:pPr>
+      <w:r>
+        <w:rPr>
+          <w:b/>
+          <w:bCs/>
+        </w:rPr>
+        <w:t xml:space="preserve">Item inativado no rastreio: </w:t>
+      </w:r>
+      <w:r>
+        <w:t xml:space="preserve">passou a aparecer em cinza no modal de rastreabilidade, mantendo a informação visível para o administrador.</w:t>
+      </w:r>
+    </w:p>
+    <w:p>
+      <w:pPr>
+        <w:pStyle w:val="ListParagraph"/>
+        <w:numPr>
+          <w:ilvl w:val="0"/>
+          <w:numId w:val="2"/>
+        </w:numPr>
+        <w:spacing w:after="100"/>
+      </w:pPr>
+      <w:r>
+        <w:rPr>
+          <w:b/>
+          <w:bCs/>
+        </w:rPr>
+        <w:t xml:space="preserve">Observação a nível do pedido: </w:t>
+      </w:r>
+      <w:r>
+        <w:t xml:space="preserve">novo campo, exibido também no cabeçalho da lista por setor, com líderes já habilitados a salvá-lo.</w:t>
+      </w:r>
+    </w:p>
+    <w:p>
+      <w:pPr>
+        <w:pStyle w:val="ListParagraph"/>
+        <w:numPr>
+          <w:ilvl w:val="0"/>
+          <w:numId w:val="2"/>
+        </w:numPr>
+        <w:spacing w:after="100"/>
+      </w:pPr>
+      <w:r>
+        <w:rPr>
+          <w:b/>
+          <w:bCs/>
+        </w:rPr>
+        <w:t xml:space="preserve">Permissão pontual "desfazer recebimento": </w:t>
+      </w:r>
+      <w:r>
+        <w:t xml:space="preserve">nova permissão que pode ser concedida individualmente a líderes específicos.</w:t>
+      </w:r>
+    </w:p>
+    <w:p>
+      <w:pPr>
+        <w:pStyle w:val="ListParagraph"/>
+        <w:numPr>
+          <w:ilvl w:val="0"/>
+          <w:numId w:val="2"/>
+        </w:numPr>
+        <w:spacing w:after="100"/>
+      </w:pPr>
+      <w:r>
+        <w:rPr>
+          <w:b/>
+          <w:bCs/>
+        </w:rPr>
+        <w:t xml:space="preserve">Ajustes de banco de dados: </w:t>
+      </w:r>
+      <w:r>
+        <w:t xml:space="preserve">tempos-limite de instrução e de espera por lock na conexão, e trava de concorrência para evitar corrida entre migrações de schema durante o deploy.</w:t>
       </w:r>
     </w:p>
     <w:p>

</xml_diff>